<commit_message>
Document how to find the admin email and password after install
Co-Authored-By: Claude Opus 5.5 <noreply@anthropic.com>
</commit_message>
<xml_diff>
--- a/คู่มือการติดตั้งและดูแลระบบ.docx
+++ b/คู่มือการติดตั้งและดูแลระบบ.docx
@@ -204,7 +204,106 @@
     </w:p>
     <w:p>
       <w:r>
-        <w:t xml:space="preserve">การติดตั้งใช้เวลาประมาณ 10 ถึง 20 นาที เมื่อเสร็จจะแสดง URL ของระบบ อีเมลและรหัสผ่านของ admin ให้บันทึกรหัสผ่านไว้ทันที เพราะจะแสดงเพียงครั้งเดียว แล้วเปลี่ยนรหัสหลัง login ครั้งแรก</w:t>
+        <w:t xml:space="preserve">การติดตั้งใช้เวลาประมาณ 10 ถึง 20 นาที เมื่อเสร็จจะแสดง URL ของระบบ อีเมลและรหัสผ่านของ admin</w:t>
+      </w:r>
+    </w:p>
+    <w:p>
+      <w:r>
+        <w:t xml:space="preserve">ระบบไม่มีรหัส admin ตั้งต้น bootstrap สุ่มรหัสให้และเก็บไว้ใน Secret Manager ส่วนอีเมลของ admin คือ </w:t>
+      </w:r>
+      <w:r>
+        <w:rPr>
+          <w:rFonts w:ascii="Consolas" w:hAnsi="Consolas" w:cs="Leelawadee UI" w:eastAsia="Leelawadee UI"/>
+          <w:sz w:val="20"/>
+          <w:szCs w:val="20"/>
+          <w:shd w:fill="F2F2F2" w:color="auto" w:val="clear"/>
+        </w:rPr>
+        <w:t xml:space="preserve">admin@example.com</w:t>
+      </w:r>
+      <w:r>
+        <w:t xml:space="preserve"> หรือ </w:t>
+      </w:r>
+      <w:r>
+        <w:rPr>
+          <w:rFonts w:ascii="Consolas" w:hAnsi="Consolas" w:cs="Leelawadee UI" w:eastAsia="Leelawadee UI"/>
+          <w:sz w:val="20"/>
+          <w:szCs w:val="20"/>
+          <w:shd w:fill="F2F2F2" w:color="auto" w:val="clear"/>
+        </w:rPr>
+        <w:t xml:space="preserve">admin@&lt;โดเมน&gt;</w:t>
+      </w:r>
+      <w:r>
+        <w:t xml:space="preserve"> ถ้าใส่ </w:t>
+      </w:r>
+      <w:r>
+        <w:rPr>
+          <w:rFonts w:ascii="Consolas" w:hAnsi="Consolas" w:cs="Leelawadee UI" w:eastAsia="Leelawadee UI"/>
+          <w:sz w:val="20"/>
+          <w:szCs w:val="20"/>
+          <w:shd w:fill="F2F2F2" w:color="auto" w:val="clear"/>
+        </w:rPr>
+        <w:t xml:space="preserve">--domain</w:t>
+      </w:r>
+      <w:r>
+        <w:t xml:space="preserve"> (เปลี่ยนได้ด้วย </w:t>
+      </w:r>
+      <w:r>
+        <w:rPr>
+          <w:rFonts w:ascii="Consolas" w:hAnsi="Consolas" w:cs="Leelawadee UI" w:eastAsia="Leelawadee UI"/>
+          <w:sz w:val="20"/>
+          <w:szCs w:val="20"/>
+          <w:shd w:fill="F2F2F2" w:color="auto" w:val="clear"/>
+        </w:rPr>
+        <w:t xml:space="preserve">--admin-email</w:t>
+      </w:r>
+      <w:r>
+        <w:t xml:space="preserve">) ถ้าไม่ได้บันทึกรหัสไว้ตอนติดตั้ง ดูได้ภายหลังด้วยคำสั่งนี้</w:t>
+      </w:r>
+    </w:p>
+    <w:p>
+      <w:pPr>
+        <w:shd w:fill="F2F2F2" w:color="auto" w:val="clear"/>
+        <w:spacing w:before="60" w:after="160"/>
+        <w:ind w:left="200" w:right="200"/>
+      </w:pPr>
+      <w:r>
+        <w:rPr>
+          <w:rFonts w:ascii="Consolas" w:hAnsi="Consolas" w:cs="Leelawadee UI" w:eastAsia="Leelawadee UI"/>
+          <w:sz w:val="19"/>
+          <w:szCs w:val="19"/>
+        </w:rPr>
+        <w:t xml:space="preserve">gcloud secrets versions access latest --secret hai-nida-admin-password --project &lt;PROJECT_ID&gt;</w:t>
+      </w:r>
+    </w:p>
+    <w:p>
+      <w:r>
+        <w:t xml:space="preserve">ดูอีเมลของ admin ได้จากบรรทัด </w:t>
+      </w:r>
+      <w:r>
+        <w:rPr>
+          <w:rFonts w:ascii="Consolas" w:hAnsi="Consolas" w:cs="Leelawadee UI" w:eastAsia="Leelawadee UI"/>
+          <w:sz w:val="20"/>
+          <w:szCs w:val="20"/>
+          <w:shd w:fill="F2F2F2" w:color="auto" w:val="clear"/>
+        </w:rPr>
+        <w:t xml:space="preserve">ADMIN_EMAIL=</w:t>
+      </w:r>
+      <w:r>
+        <w:t xml:space="preserve"> ในผลของคำสั่ง </w:t>
+      </w:r>
+      <w:r>
+        <w:rPr>
+          <w:rFonts w:ascii="Consolas" w:hAnsi="Consolas" w:cs="Leelawadee UI" w:eastAsia="Leelawadee UI"/>
+          <w:sz w:val="20"/>
+          <w:szCs w:val="20"/>
+          <w:shd w:fill="F2F2F2" w:color="auto" w:val="clear"/>
+        </w:rPr>
+        <w:t xml:space="preserve">gcloud secrets versions access latest --secret hai-nida-app-config --project &lt;PROJECT_ID&gt;</w:t>
+      </w:r>
+    </w:p>
+    <w:p>
+      <w:r>
+        <w:t xml:space="preserve">หลัง login ครั้งแรกให้เปลี่ยนรหัสผ่านทางหน้าเว็บ รหัสใน Secret Manager ใช้สร้าง admin คนแรกเท่านั้น และจะไม่เปลี่ยนตามรหัสที่ตั้งใหม่</w:t>
       </w:r>
     </w:p>
     <w:p>
@@ -1951,7 +2050,7 @@
       <w:r>
         <w:t xml:space="preserve">ตัวเลขด้านล่างเป็นค่าประมาณสำหรับ region asia-southeast1 (สิงคโปร์) แบบไม่มีส่วนลด ราคาจริงขึ้นกับการใช้งานและอาจเปลี่ยนแปลง ให้ตรวจสอบกับ </w:t>
       </w:r>
-      <w:hyperlink w:history="1" r:id="rIdwaah9fl_mpnvxnrhcmtio">
+      <w:hyperlink w:history="1" r:id="rIdrd-rt7nbfdhitxhptzh9w">
         <w:r>
           <w:rPr>
             <w:rStyle w:val="Hyperlink"/>
@@ -2420,19 +2519,7 @@
     </w:p>
     <w:p>
       <w:r>
-        <w:t xml:space="preserve">ถ้า login admin ไม่ได้หลังติดตั้ง ดูรหัสผ่านที่ใช้สร้าง admin ได้ด้วย </w:t>
-      </w:r>
-      <w:r>
-        <w:rPr>
-          <w:rFonts w:ascii="Consolas" w:hAnsi="Consolas" w:cs="Leelawadee UI" w:eastAsia="Leelawadee UI"/>
-          <w:sz w:val="20"/>
-          <w:szCs w:val="20"/>
-          <w:shd w:fill="F2F2F2" w:color="auto" w:val="clear"/>
-        </w:rPr>
-        <w:t xml:space="preserve">gcloud secrets versions access latest --secret hai-nida-admin-password --project &lt;PROJECT_ID&gt;</w:t>
-      </w:r>
-      <w:r>
-        <w:t xml:space="preserve"> ถ้าเปลี่ยนรหัสผ่านทางเว็บแล้วลืม ให้ติดต่อทีมพัฒนา</w:t>
+        <w:t xml:space="preserve">ถ้า login admin ไม่ได้หลังติดตั้ง ตรวจอีเมลและรหัสผ่านตามคำสั่งในหัวข้อที่ 2 ถ้าเปลี่ยนรหัสผ่านทางเว็บแล้วลืม ให้ติดต่อทีมพัฒนา</w:t>
       </w:r>
     </w:p>
     <w:p>

</xml_diff>

<commit_message>
Default to gemini-3.5-flash and document Gemini API prepaid credits
- Default model for planner, writer and grader is now gemini-3.5-flash;
  models already chosen on the Admin page are kept
- Show a clear message when the model test fails with 402 (no credits)
- DEPLOY.md: set up Prepay in AI Studio before use, credit expiry, what
  happens at zero balance, 402 troubleshooting; bootstrap summary reminds
  about credits

Co-Authored-By: Claude Opus 5.5 <noreply@anthropic.com>
</commit_message>
<xml_diff>
--- a/คู่มือการติดตั้งและดูแลระบบ.docx
+++ b/คู่มือการติดตั้งและดูแลระบบ.docx
@@ -103,6 +103,95 @@
       </w:r>
       <w:r>
         <w:t xml:space="preserve"> พร้อมใช้) หรือเครื่องที่ติดตั้ง Google Cloud CLI แล้ว</w:t>
+      </w:r>
+    </w:p>
+    <w:p>
+      <w:pPr>
+        <w:pStyle w:val="ListParagraph"/>
+        <w:numPr>
+          <w:ilvl w:val="0"/>
+          <w:numId w:val="2"/>
+        </w:numPr>
+      </w:pPr>
+      <w:r>
+        <w:t xml:space="preserve">เครดิต Gemini API แบบเติมเงินล่วงหน้า (Prepay) ของ project เดียวกัน ตามขั้นตอนด้านล่าง</w:t>
+      </w:r>
+    </w:p>
+    <w:p>
+      <w:pPr>
+        <w:pStyle w:val="Heading2"/>
+      </w:pPr>
+      <w:r>
+        <w:t xml:space="preserve">เตรียมเครดิต Gemini API (Prepay)</w:t>
+      </w:r>
+    </w:p>
+    <w:p>
+      <w:r>
+        <w:t xml:space="preserve">Gemini API คิดเงินแบบเติมเครดิตล่วงหน้า บัญชีใหม่จะได้แผน Prepay เป็นค่าตั้งต้น ถ้า project ไม่มีเครดิต ระบบจะติดตั้งได้แต่สร้างคอร์สและแบบทดสอบไม่ได้ ทำขั้นตอนนี้ก่อนหรือหลังรัน bootstrap ก็ได้ แต่ต้องเป็น project เดียวกับที่ติดตั้งระบบ เพราะ API key ที่ bootstrap สร้างจะใช้สถานะการเรียกเก็บเงินของ project นั้น</w:t>
+      </w:r>
+    </w:p>
+    <w:p>
+      <w:pPr>
+        <w:pStyle w:val="ListParagraph"/>
+        <w:numPr>
+          <w:ilvl w:val="0"/>
+          <w:numId w:val="3"/>
+        </w:numPr>
+      </w:pPr>
+      <w:r>
+        <w:t xml:space="preserve">เปิด https://aistudio.google.com/projects ด้วยบัญชีที่เป็น Owner ของ project</w:t>
+      </w:r>
+    </w:p>
+    <w:p>
+      <w:pPr>
+        <w:pStyle w:val="ListParagraph"/>
+        <w:numPr>
+          <w:ilvl w:val="0"/>
+          <w:numId w:val="3"/>
+        </w:numPr>
+      </w:pPr>
+      <w:r>
+        <w:t xml:space="preserve">ที่แถวของ project ในคอลัมน์ Billing Tier กด Set up billing (หรือ Set up Prepay ถ้า project ผูก billing account ไว้แล้ว) แล้วเลือก billing account</w:t>
+      </w:r>
+    </w:p>
+    <w:p>
+      <w:pPr>
+        <w:pStyle w:val="ListParagraph"/>
+        <w:numPr>
+          <w:ilvl w:val="0"/>
+          <w:numId w:val="3"/>
+        </w:numPr>
+      </w:pPr>
+      <w:r>
+        <w:t xml:space="preserve">ซื้อเครดิตที่ https://aistudio.google.com/billing ด้วยปุ่ม Buy credits ขั้นต่ำ 5 USD</w:t>
+      </w:r>
+    </w:p>
+    <w:p>
+      <w:pPr>
+        <w:pStyle w:val="ListParagraph"/>
+        <w:numPr>
+          <w:ilvl w:val="0"/>
+          <w:numId w:val="3"/>
+        </w:numPr>
+      </w:pPr>
+      <w:r>
+        <w:t xml:space="preserve">แนะนำให้เปิดเติมเงินอัตโนมัติด้วยปุ่ม Setup auto-reload ในการ์ด Available credits และกำหนด Monthly Limit เพื่อคุมค่าใช้จ่าย</w:t>
+      </w:r>
+    </w:p>
+    <w:p>
+      <w:r>
+        <w:t xml:space="preserve">เครดิตมีอายุ 12 เดือนนับจากวันซื้อและขอคืนไม่ได้ เมื่อเครดิตเหลือ 0 API key ทุกตัวใน billing account นั้นจะหยุดทำงานทันที (ระบบได้ error 402 Payment Required) จนกว่าจะเติมเครดิต จึงควรตรวจยอดคงเหลือเป็นระยะหรือเปิด auto-reload ไว้ ขั้นตอนนี้อ้างอิงจาก</w:t>
+      </w:r>
+      <w:hyperlink w:history="1" r:id="rIdbmcppjep1jpljoh34--qa">
+        <w:r>
+          <w:rPr>
+            <w:rStyle w:val="Hyperlink"/>
+          </w:rPr>
+          <w:t xml:space="preserve">เอกสาร Billing ของ Gemini API</w:t>
+        </w:r>
+      </w:hyperlink>
+      <w:r>
+        <w:t xml:space="preserve"> ณ ตุลาคม 2026 ชื่อปุ่มและหน้าจออาจเปลี่ยนได้</w:t>
       </w:r>
     </w:p>
     <w:p>
@@ -1714,7 +1803,7 @@
         <w:pStyle w:val="ListParagraph"/>
         <w:numPr>
           <w:ilvl w:val="0"/>
-          <w:numId w:val="3"/>
+          <w:numId w:val="4"/>
         </w:numPr>
       </w:pPr>
       <w:r>
@@ -1740,93 +1829,6 @@
           <w:shd w:fill="F2F2F2" w:color="auto" w:val="clear"/>
         </w:rPr>
         <w:t xml:space="preserve">gcloud compute addresses describe hai-nida-ip --region asia-southeast1 --project &lt;PROJECT_ID&gt; --format='value(address)'</w:t>
-      </w:r>
-    </w:p>
-    <w:p>
-      <w:pPr>
-        <w:pStyle w:val="ListParagraph"/>
-        <w:numPr>
-          <w:ilvl w:val="0"/>
-          <w:numId w:val="3"/>
-        </w:numPr>
-      </w:pPr>
-      <w:r>
-        <w:t xml:space="preserve">รัน </w:t>
-      </w:r>
-      <w:r>
-        <w:rPr>
-          <w:rFonts w:ascii="Consolas" w:hAnsi="Consolas" w:cs="Leelawadee UI" w:eastAsia="Leelawadee UI"/>
-          <w:sz w:val="20"/>
-          <w:szCs w:val="20"/>
-          <w:shd w:fill="F2F2F2" w:color="auto" w:val="clear"/>
-        </w:rPr>
-        <w:t xml:space="preserve">./scripts/rotate-secret.sh app-config --project &lt;PROJECT_ID&gt;</w:t>
-      </w:r>
-      <w:r>
-        <w:t xml:space="preserve"> แล้วเพิ่มบรรทัด </w:t>
-      </w:r>
-      <w:r>
-        <w:rPr>
-          <w:rFonts w:ascii="Consolas" w:hAnsi="Consolas" w:cs="Leelawadee UI" w:eastAsia="Leelawadee UI"/>
-          <w:sz w:val="20"/>
-          <w:szCs w:val="20"/>
-          <w:shd w:fill="F2F2F2" w:color="auto" w:val="clear"/>
-        </w:rPr>
-        <w:t xml:space="preserve">SITE_ADDRESS=lms.example.com</w:t>
-      </w:r>
-    </w:p>
-    <w:p>
-      <w:pPr>
-        <w:pStyle w:val="ListParagraph"/>
-        <w:numPr>
-          <w:ilvl w:val="0"/>
-          <w:numId w:val="3"/>
-        </w:numPr>
-      </w:pPr>
-      <w:r>
-        <w:t xml:space="preserve">Caddy จะออกใบรับรอง HTTPS ให้อัตโนมัติภายในไม่กี่นาทีหลัง DNS มีผล</w:t>
-      </w:r>
-    </w:p>
-    <w:p>
-      <w:r>
-        <w:t xml:space="preserve">ถ้าติดตั้งใหม่และมีโดเมนอยู่แล้ว ใส่ </w:t>
-      </w:r>
-      <w:r>
-        <w:rPr>
-          <w:rFonts w:ascii="Consolas" w:hAnsi="Consolas" w:cs="Leelawadee UI" w:eastAsia="Leelawadee UI"/>
-          <w:sz w:val="20"/>
-          <w:szCs w:val="20"/>
-          <w:shd w:fill="F2F2F2" w:color="auto" w:val="clear"/>
-        </w:rPr>
-        <w:t xml:space="preserve">--domain lms.example.com</w:t>
-      </w:r>
-      <w:r>
-        <w:t xml:space="preserve"> ตอนรัน bootstrap ได้เลย ห้ามใส่ </w:t>
-      </w:r>
-      <w:r>
-        <w:rPr>
-          <w:rFonts w:ascii="Consolas" w:hAnsi="Consolas" w:cs="Leelawadee UI" w:eastAsia="Leelawadee UI"/>
-          <w:sz w:val="20"/>
-          <w:szCs w:val="20"/>
-          <w:shd w:fill="F2F2F2" w:color="auto" w:val="clear"/>
-        </w:rPr>
-        <w:t xml:space="preserve">SITE_ADDRESS=</w:t>
-      </w:r>
-      <w:r>
-        <w:t xml:space="preserve"> แบบไม่มีค่า ถ้าเลิกใช้โดเมนให้ลบทั้งบรรทัด</w:t>
-      </w:r>
-    </w:p>
-    <w:p>
-      <w:pPr>
-        <w:pStyle w:val="Heading1"/>
-      </w:pPr>
-      <w:r>
-        <w:t xml:space="preserve">6. Backup และ restore</w:t>
-      </w:r>
-    </w:p>
-    <w:p>
-      <w:r>
-        <w:t xml:space="preserve">ข้อมูลของระบบมี 2 ส่วน คือฐานข้อมูล ChromaDB (ผู้ใช้ คอร์ส ผลแบบทดสอบ) และไฟล์ PDF ที่อัปโหลด ระบบ backup ให้ 3 ชั้น</w:t>
       </w:r>
     </w:p>
     <w:p>
@@ -1838,31 +1840,28 @@
         </w:numPr>
       </w:pPr>
       <w:r>
-        <w:t xml:space="preserve">ChromaDB ทุกวัน 03:00 น. เก็บในเครื่อง 7 ชุดที่ </w:t>
-      </w:r>
-      <w:r>
-        <w:rPr>
-          <w:rFonts w:ascii="Consolas" w:hAnsi="Consolas" w:cs="Leelawadee UI" w:eastAsia="Leelawadee UI"/>
-          <w:sz w:val="20"/>
-          <w:szCs w:val="20"/>
-          <w:shd w:fill="F2F2F2" w:color="auto" w:val="clear"/>
-        </w:rPr>
-        <w:t xml:space="preserve">/opt/hai-nida/backups/chromadb/</w:t>
-      </w:r>
-      <w:r>
-        <w:t xml:space="preserve"> และอัปโหลดขึ้น bucket </w:t>
-      </w:r>
-      <w:r>
-        <w:rPr>
-          <w:rFonts w:ascii="Consolas" w:hAnsi="Consolas" w:cs="Leelawadee UI" w:eastAsia="Leelawadee UI"/>
-          <w:sz w:val="20"/>
-          <w:szCs w:val="20"/>
-          <w:shd w:fill="F2F2F2" w:color="auto" w:val="clear"/>
-        </w:rPr>
-        <w:t xml:space="preserve">&lt;PROJECT_ID&gt;-hai-nida-backups</w:t>
-      </w:r>
-      <w:r>
-        <w:t xml:space="preserve"> เก็บ 30 วัน ทุกครั้งที่อัปเดตเวอร์ชันจะ backup ก่อนด้วย</w:t>
+        <w:t xml:space="preserve">รัน </w:t>
+      </w:r>
+      <w:r>
+        <w:rPr>
+          <w:rFonts w:ascii="Consolas" w:hAnsi="Consolas" w:cs="Leelawadee UI" w:eastAsia="Leelawadee UI"/>
+          <w:sz w:val="20"/>
+          <w:szCs w:val="20"/>
+          <w:shd w:fill="F2F2F2" w:color="auto" w:val="clear"/>
+        </w:rPr>
+        <w:t xml:space="preserve">./scripts/rotate-secret.sh app-config --project &lt;PROJECT_ID&gt;</w:t>
+      </w:r>
+      <w:r>
+        <w:t xml:space="preserve"> แล้วเพิ่มบรรทัด </w:t>
+      </w:r>
+      <w:r>
+        <w:rPr>
+          <w:rFonts w:ascii="Consolas" w:hAnsi="Consolas" w:cs="Leelawadee UI" w:eastAsia="Leelawadee UI"/>
+          <w:sz w:val="20"/>
+          <w:szCs w:val="20"/>
+          <w:shd w:fill="F2F2F2" w:color="auto" w:val="clear"/>
+        </w:rPr>
+        <w:t xml:space="preserve">SITE_ADDRESS=lms.example.com</w:t>
       </w:r>
     </w:p>
     <w:p>
@@ -1874,7 +1873,49 @@
         </w:numPr>
       </w:pPr>
       <w:r>
-        <w:t xml:space="preserve">Snapshot ของ disk ทั้งเครื่องทุกวัน 02:00 น. เก็บ 7 วัน ครอบคลุมทั้ง ChromaDB และไฟล์ PDF</w:t>
+        <w:t xml:space="preserve">Caddy จะออกใบรับรอง HTTPS ให้อัตโนมัติภายในไม่กี่นาทีหลัง DNS มีผล</w:t>
+      </w:r>
+    </w:p>
+    <w:p>
+      <w:r>
+        <w:t xml:space="preserve">ถ้าติดตั้งใหม่และมีโดเมนอยู่แล้ว ใส่ </w:t>
+      </w:r>
+      <w:r>
+        <w:rPr>
+          <w:rFonts w:ascii="Consolas" w:hAnsi="Consolas" w:cs="Leelawadee UI" w:eastAsia="Leelawadee UI"/>
+          <w:sz w:val="20"/>
+          <w:szCs w:val="20"/>
+          <w:shd w:fill="F2F2F2" w:color="auto" w:val="clear"/>
+        </w:rPr>
+        <w:t xml:space="preserve">--domain lms.example.com</w:t>
+      </w:r>
+      <w:r>
+        <w:t xml:space="preserve"> ตอนรัน bootstrap ได้เลย ห้ามใส่ </w:t>
+      </w:r>
+      <w:r>
+        <w:rPr>
+          <w:rFonts w:ascii="Consolas" w:hAnsi="Consolas" w:cs="Leelawadee UI" w:eastAsia="Leelawadee UI"/>
+          <w:sz w:val="20"/>
+          <w:szCs w:val="20"/>
+          <w:shd w:fill="F2F2F2" w:color="auto" w:val="clear"/>
+        </w:rPr>
+        <w:t xml:space="preserve">SITE_ADDRESS=</w:t>
+      </w:r>
+      <w:r>
+        <w:t xml:space="preserve"> แบบไม่มีค่า ถ้าเลิกใช้โดเมนให้ลบทั้งบรรทัด</w:t>
+      </w:r>
+    </w:p>
+    <w:p>
+      <w:pPr>
+        <w:pStyle w:val="Heading1"/>
+      </w:pPr>
+      <w:r>
+        <w:t xml:space="preserve">6. Backup และ restore</w:t>
+      </w:r>
+    </w:p>
+    <w:p>
+      <w:r>
+        <w:t xml:space="preserve">ข้อมูลของระบบมี 2 ส่วน คือฐานข้อมูล ChromaDB (ผู้ใช้ คอร์ส ผลแบบทดสอบ) และไฟล์ PDF ที่อัปโหลด ระบบ backup ให้ 3 ชั้น</w:t>
       </w:r>
     </w:p>
     <w:p>
@@ -1882,7 +1923,55 @@
         <w:pStyle w:val="ListParagraph"/>
         <w:numPr>
           <w:ilvl w:val="0"/>
-          <w:numId w:val="4"/>
+          <w:numId w:val="5"/>
+        </w:numPr>
+      </w:pPr>
+      <w:r>
+        <w:t xml:space="preserve">ChromaDB ทุกวัน 03:00 น. เก็บในเครื่อง 7 ชุดที่ </w:t>
+      </w:r>
+      <w:r>
+        <w:rPr>
+          <w:rFonts w:ascii="Consolas" w:hAnsi="Consolas" w:cs="Leelawadee UI" w:eastAsia="Leelawadee UI"/>
+          <w:sz w:val="20"/>
+          <w:szCs w:val="20"/>
+          <w:shd w:fill="F2F2F2" w:color="auto" w:val="clear"/>
+        </w:rPr>
+        <w:t xml:space="preserve">/opt/hai-nida/backups/chromadb/</w:t>
+      </w:r>
+      <w:r>
+        <w:t xml:space="preserve"> และอัปโหลดขึ้น bucket </w:t>
+      </w:r>
+      <w:r>
+        <w:rPr>
+          <w:rFonts w:ascii="Consolas" w:hAnsi="Consolas" w:cs="Leelawadee UI" w:eastAsia="Leelawadee UI"/>
+          <w:sz w:val="20"/>
+          <w:szCs w:val="20"/>
+          <w:shd w:fill="F2F2F2" w:color="auto" w:val="clear"/>
+        </w:rPr>
+        <w:t xml:space="preserve">&lt;PROJECT_ID&gt;-hai-nida-backups</w:t>
+      </w:r>
+      <w:r>
+        <w:t xml:space="preserve"> เก็บ 30 วัน ทุกครั้งที่อัปเดตเวอร์ชันจะ backup ก่อนด้วย</w:t>
+      </w:r>
+    </w:p>
+    <w:p>
+      <w:pPr>
+        <w:pStyle w:val="ListParagraph"/>
+        <w:numPr>
+          <w:ilvl w:val="0"/>
+          <w:numId w:val="5"/>
+        </w:numPr>
+      </w:pPr>
+      <w:r>
+        <w:t xml:space="preserve">Snapshot ของ disk ทั้งเครื่องทุกวัน 02:00 น. เก็บ 7 วัน ครอบคลุมทั้ง ChromaDB และไฟล์ PDF</w:t>
+      </w:r>
+    </w:p>
+    <w:p>
+      <w:pPr>
+        <w:pStyle w:val="ListParagraph"/>
+        <w:numPr>
+          <w:ilvl w:val="0"/>
+          <w:numId w:val="5"/>
         </w:numPr>
       </w:pPr>
       <w:r>
@@ -2050,7 +2139,7 @@
       <w:r>
         <w:t xml:space="preserve">ตัวเลขด้านล่างเป็นค่าประมาณสำหรับ region asia-southeast1 (สิงคโปร์) แบบไม่มีส่วนลด ราคาจริงขึ้นกับการใช้งานและอาจเปลี่ยนแปลง ให้ตรวจสอบกับ </w:t>
       </w:r>
-      <w:hyperlink w:history="1" r:id="rIdrd-rt7nbfdhitxhptzh9w">
+      <w:hyperlink w:history="1" r:id="rId68hqckvcyl0ibfugh2jas">
         <w:r>
           <w:rPr>
             <w:rStyle w:val="Hyperlink"/>
@@ -2426,7 +2515,7 @@
     </w:p>
     <w:p>
       <w:r>
-        <w:t xml:space="preserve">ค่า Gemini API คิดตามปริมาณการใช้งานจริง ไม่รวมในตารางนี้ ตรวจได้ที่หน้า Billing ของ project</w:t>
+        <w:t xml:space="preserve">ค่า Gemini API ไม่รวมในตารางนี้ ตัดจากเครดิต Prepay ตามปริมาณการใช้งานจริง (เติมขั้นต่ำครั้งละ 5 USD) ดูยอดคงเหลือและการใช้งานได้ที่ https://aistudio.google.com/billing</w:t>
       </w:r>
     </w:p>
     <w:p>
@@ -2550,7 +2639,7 @@
     </w:p>
     <w:p>
       <w:r>
-        <w:t xml:space="preserve">ถ้าระบบสร้างคอร์สไม่ได้ มักเกิดจาก Gemini API key ใช้ไม่ได้หรือเกินโควตา ตรวจ key ในหน้า Admin &gt; Settings หรือเปลี่ยนด้วย </w:t>
+        <w:t xml:space="preserve">ถ้าระบบสร้างคอร์สไม่ได้ ให้ตรวจเครดิต Gemini API ที่ https://aistudio.google.com/billing ก่อน ถ้า error เป็น 402 Payment Required แปลว่าเครดิตหมดหรือยังไม่ได้ตั้งค่า Prepay ให้เติมเครดิตตามหัวข้อที่ 1 ถ้าเครดิตยังมี อาจเกิดจาก API key ใช้ไม่ได้หรือเกิน rate limit ตรวจ key ในหน้า Admin &gt; Settings หรือเปลี่ยนด้วย </w:t>
       </w:r>
       <w:r>
         <w:rPr>
@@ -2915,6 +3004,12 @@
     </w:lvlOverride>
   </w:num>
   <w:num w:numId="4">
+    <w:abstractNumId w:val="2"/>
+    <w:lvlOverride w:ilvl="0">
+      <w:startOverride w:val="1"/>
+    </w:lvlOverride>
+  </w:num>
+  <w:num w:numId="5">
     <w:abstractNumId w:val="2"/>
     <w:lvlOverride w:ilvl="0">
       <w:startOverride w:val="1"/>
@@ -3089,6 +3184,25 @@
       <w:szCs w:val="40"/>
     </w:rPr>
   </w:style>
+  <w:style w:type="paragraph" w:styleId="Heading2">
+    <w:name w:val="Heading 2"/>
+    <w:basedOn w:val="Normal"/>
+    <w:next w:val="Normal"/>
+    <w:qFormat/>
+    <w:pPr>
+      <w:keepNext/>
+      <w:spacing w:before="240" w:after="120"/>
+      <w:outlineLvl w:val="1"/>
+    </w:pPr>
+    <w:rPr>
+      <w:rFonts w:ascii="Calibri" w:hAnsi="Calibri" w:cs="Leelawadee UI" w:eastAsia="Leelawadee UI"/>
+      <w:b/>
+      <w:bCs/>
+      <w:color w:val="2F5496"/>
+      <w:sz w:val="25"/>
+      <w:szCs w:val="25"/>
+    </w:rPr>
+  </w:style>
   <w:style w:type="paragraph" w:styleId="Heading1">
     <w:name w:val="Heading 1"/>
     <w:basedOn w:val="Normal"/>

</xml_diff>

<commit_message>
Use sudo in VM log commands
The SSH user does not own /opt/hai-nida, so git refuses it as dubious
ownership, and reading system journals needs privileges.

Co-Authored-By: Claude Opus 5.5 <noreply@anthropic.com>
</commit_message>
<xml_diff>
--- a/คู่มือการติดตั้งและดูแลระบบ.docx
+++ b/คู่มือการติดตั้งและดูแลระบบ.docx
@@ -182,7 +182,7 @@
       <w:r>
         <w:t xml:space="preserve">เครดิตมีอายุ 12 เดือนนับจากวันซื้อและขอคืนไม่ได้ เมื่อเครดิตเหลือ 0 API key ทุกตัวใน billing account นั้นจะหยุดทำงานทันที (ระบบได้ error 402 Payment Required) จนกว่าจะเติมเครดิต จึงควรตรวจยอดคงเหลือเป็นระยะหรือเปิด auto-reload ไว้ ขั้นตอนนี้อ้างอิงจาก</w:t>
       </w:r>
-      <w:hyperlink w:history="1" r:id="rIdbmcppjep1jpljoh34--qa">
+      <w:hyperlink w:history="1" r:id="rId1zsugxt4z0tokd6ljtglj">
         <w:r>
           <w:rPr>
             <w:rStyle w:val="Hyperlink"/>
@@ -1224,7 +1224,19 @@
     </w:p>
     <w:p>
       <w:r>
-        <w:t xml:space="preserve">ดู log การอัปเดต</w:t>
+        <w:t xml:space="preserve">ดูเวอร์ชันที่ VM ใช้อยู่และ log การอัปเดต (บรรทัดแรกคือ commit ปัจจุบัน ครั้งแรกที่ใช้ </w:t>
+      </w:r>
+      <w:r>
+        <w:rPr>
+          <w:rFonts w:ascii="Consolas" w:hAnsi="Consolas" w:cs="Leelawadee UI" w:eastAsia="Leelawadee UI"/>
+          <w:sz w:val="20"/>
+          <w:szCs w:val="20"/>
+          <w:shd w:fill="F2F2F2" w:color="auto" w:val="clear"/>
+        </w:rPr>
+        <w:t xml:space="preserve">gcloud compute ssh</w:t>
+      </w:r>
+      <w:r>
+        <w:t xml:space="preserve"> ระบบจะสร้าง SSH key และถาม passphrase ให้กด Enter ผ่านได้)</w:t>
       </w:r>
     </w:p>
     <w:p>
@@ -1254,7 +1266,7 @@
           <w:sz w:val="19"/>
           <w:szCs w:val="19"/>
         </w:rPr>
-        <w:t xml:space="preserve">  --command 'journalctl -u hai-nida-update -n 100 --no-pager'</w:t>
+        <w:t xml:space="preserve">  --command 'sudo -u deploy git -C /opt/hai-nida log -1 --oneline; sudo journalctl -u hai-nida-update -n 100 --no-pager'</w:t>
       </w:r>
     </w:p>
     <w:p>
@@ -2139,7 +2151,7 @@
       <w:r>
         <w:t xml:space="preserve">ตัวเลขด้านล่างเป็นค่าประมาณสำหรับ region asia-southeast1 (สิงคโปร์) แบบไม่มีส่วนลด ราคาจริงขึ้นกับการใช้งานและอาจเปลี่ยนแปลง ให้ตรวจสอบกับ </w:t>
       </w:r>
-      <w:hyperlink w:history="1" r:id="rId68hqckvcyl0ibfugh2jas">
+      <w:hyperlink w:history="1" r:id="rIdqczewz4xbwe9vxlf23sbb">
         <w:r>
           <w:rPr>
             <w:rStyle w:val="Hyperlink"/>

</xml_diff>